<commit_message>
feat: master template replication, prepared_by field, 25-requirements cap, approved filtering, and workable Zoho suite
</commit_message>
<xml_diff>
--- a/backend/templates/Leskode_Master_SOW_Template.docx
+++ b/backend/templates/Leskode_Master_SOW_Template.docx
@@ -119,7 +119,7 @@
           <w:color w:val="64748B"/>
           <w:sz w:val="19"/>
         </w:rPr>
-        <w:t>Version 1.0 | October 2026  •  Prepared by Monish  •  Contact: +91 9500424307</w:t>
+        <w:t>Version 1.0 | October 2026  •  Prepared by Leskode Solutions Team  •  Contact: +91 9500424307</w:t>
       </w:r>
     </w:p>
     <w:p>
@@ -7344,7 +7344,7 @@
           <w:color w:val="64748B"/>
           <w:sz w:val="17"/>
         </w:rPr>
-        <w:t>Confidential — Leskode  |  Prepared by Monish  |  Shavs Technologies Pvt Ltd, Coimbatore</w:t>
+        <w:t>Confidential — Leskode  |  Prepared by Leskode Solutions Team  |  Shavs Technologies Pvt Ltd, Coimbatore</w:t>
       </w:r>
     </w:p>
     <w:sectPr>

</xml_diff>